<commit_message>
Agregar interfaz ejecutable, diagramas de Visual Paradigm y evidencia al informe
</commit_message>
<xml_diff>
--- a/SmartLibrary_Bloque5.docx
+++ b/SmartLibrary_Bloque5.docx
@@ -1219,8 +1219,8 @@
       <w:r>
         <w:drawing>
           <wp:inline xmlns:a="http://schemas.openxmlformats.org/drawingml/2006/main" xmlns:pic="http://schemas.openxmlformats.org/drawingml/2006/picture">
-            <wp:extent cx="6492240" cy="6770479"/>
-            <wp:docPr id="1" name="Picture 1" descr="clases UML de SmartLibrary"/>
+            <wp:extent cx="6492240" cy="7048321"/>
+            <wp:docPr id="3" name="Picture 3" descr="Diagrama de clases de SmartLibrary exportado desde Visual Paradigm Online"/>
             <wp:cNvGraphicFramePr>
               <a:graphicFrameLocks noChangeAspect="1"/>
             </wp:cNvGraphicFramePr>
@@ -1228,11 +1228,11 @@
               <a:graphicData uri="http://schemas.openxmlformats.org/drawingml/2006/picture">
                 <pic:pic>
                   <pic:nvPicPr>
-                    <pic:cNvPr id="0" name="clases.png"/>
+                    <pic:cNvPr id="0" name="clases_vp.png"/>
                     <pic:cNvPicPr/>
                   </pic:nvPicPr>
                   <pic:blipFill>
-                    <a:blip r:embed="rId10"/>
+                    <a:blip r:embed="rId12"/>
                     <a:stretch>
                       <a:fillRect/>
                     </a:stretch>
@@ -1240,7 +1240,7 @@
                   <pic:spPr>
                     <a:xfrm>
                       <a:off x="0" y="0"/>
-                      <a:ext cx="6492240" cy="6770479"/>
+                      <a:ext cx="6492240" cy="7048321"/>
                     </a:xfrm>
                     <a:prstGeom prst="rect"/>
                   </pic:spPr>
@@ -1255,6 +1255,19 @@
       <w:r>
         <w:t>El triángulo apunta a Usuario o Notificable. La realización se dibuja con línea discontinua; los rombos quedan en Libro y Prestamo. Las asociaciones de Reserva completan la vista del dominio: cada reserva pertenece a un estudiante y solicita un libro. Reserva se conserva solo en el modelo de este taller.</w:t>
       </w:r>
+    </w:p>
+    <w:p>
+      <w:pPr>
+        <w:spacing w:after="100"/>
+      </w:pPr>
+      <w:hyperlink r:id="rId14">
+        <w:r>
+          <w:rPr>
+            <w:color w:val="0563C1"/>
+          </w:rPr>
+          <w:t>Diagrama de clases editable en Visual Paradigm Online</w:t>
+        </w:r>
+      </w:hyperlink>
     </w:p>
     <w:p>
       <w:r>
@@ -1585,7 +1598,7 @@
     </w:p>
     <w:p>
       <w:r>
-        <w:t>El repositorio contiene Usuario, Estudiante, Bibliotecario, Renovacion y Prestamo. Libro y Ejemplar permiten construir el préstamo de la prueba; PruebaSmartLibrary ejecuta los casos. Los constructores de las especializaciones llaman a super y guardan sus datos particulares.</w:t>
+        <w:t>El repositorio contiene Usuario, Estudiante, Bibliotecario, Renovacion y Prestamo. Libro y Ejemplar permiten construir el préstamo de la prueba; PruebaSmartLibrary ejecuta los casos. Los constructores de las especializaciones llaman a super y guardan sus datos particulares. SmartLibraryInterfaz permite ejecutar el mismo ejemplo desde una ventana, sin ampliar las funciones del dominio.</w:t>
       </w:r>
     </w:p>
     <w:p>
@@ -1665,7 +1678,7 @@
     </w:p>
     <w:p>
       <w:r>
-        <w:t>Se compiló el fragmento con JDK 25 y se ejecutó PruebaSmartLibrary el 30 de septiembre de 2026. La salida completa está en evidencia/ejecucion.txt. Las comprobaciones de la prueba generan un error si no se conserva alguna de las fechas o si un rechazo altera el historial.</w:t>
+        <w:t>Se compiló el fragmento con JDK 25 para Java 17 y se ejecutó PruebaSmartLibrary el 30 de septiembre de 2026. La salida completa está en evidencia/ejecucion.txt. Las comprobaciones generan un error si no se conserva alguna de las fechas o si un rechazo altera el historial.</w:t>
       </w:r>
     </w:p>
     <w:tbl>
@@ -2040,27 +2053,29 @@
       </w:r>
     </w:p>
     <w:p>
+      <w:pPr>
+        <w:pStyle w:val="Heading2"/>
+        <w:pageBreakBefore/>
+      </w:pPr>
       <w:r>
-        <w:br w:type="page"/>
+        <w:t>Prueba desde la interfaz</w:t>
+      </w:r>
+    </w:p>
+    <w:p>
+      <w:r>
+        <w:t>La ventana ejecuta la renovación del mismo préstamo. Se abre con Ejecutar_SmartLibrary.cmd o con SmartLibrary.jar. La fecha vigente y la tabla permiten comprobar el resultado de cada intento.</w:t>
       </w:r>
     </w:p>
     <w:p>
       <w:pPr>
-        <w:pStyle w:val="Heading1"/>
-      </w:pPr>
-      <w:r>
-        <w:t>8 Vista funcional mediante componentes UML</w:t>
-      </w:r>
-    </w:p>
-    <w:p>
-      <w:pPr>
+        <w:spacing w:after="60"/>
         <w:jc w:val="center"/>
       </w:pPr>
       <w:r>
         <w:drawing>
           <wp:inline xmlns:a="http://schemas.openxmlformats.org/drawingml/2006/main" xmlns:pic="http://schemas.openxmlformats.org/drawingml/2006/picture">
-            <wp:extent cx="5852160" cy="3466279"/>
-            <wp:docPr id="2" name="Picture 2" descr="componentes UML de SmartLibrary"/>
+            <wp:extent cx="5166360" cy="3418260"/>
+            <wp:docPr id="5" name="Picture 5" descr="Renovación válida del 8 al 15 de octubre de 2026. El historial registra las tres fechas y queda con una entrada."/>
             <wp:cNvGraphicFramePr>
               <a:graphicFrameLocks noChangeAspect="1"/>
             </wp:cNvGraphicFramePr>
@@ -2068,11 +2083,11 @@
               <a:graphicData uri="http://schemas.openxmlformats.org/drawingml/2006/picture">
                 <pic:pic>
                   <pic:nvPicPr>
-                    <pic:cNvPr id="0" name="componentes.png"/>
+                    <pic:cNvPr id="0" name="interfaz_valida.png"/>
                     <pic:cNvPicPr/>
                   </pic:nvPicPr>
                   <pic:blipFill>
-                    <a:blip r:embed="rId11"/>
+                    <a:blip r:embed="rId16"/>
                     <a:stretch>
                       <a:fillRect/>
                     </a:stretch>
@@ -2080,7 +2095,7 @@
                   <pic:spPr>
                     <a:xfrm>
                       <a:off x="0" y="0"/>
-                      <a:ext cx="5852160" cy="3466279"/>
+                      <a:ext cx="5166360" cy="3418260"/>
                     </a:xfrm>
                     <a:prstGeom prst="rect"/>
                   </pic:spPr>
@@ -2092,9 +2107,141 @@
       </w:r>
     </w:p>
     <w:p>
+      <w:pPr>
+        <w:spacing w:after="120"/>
+      </w:pPr>
+      <w:r>
+        <w:rPr>
+          <w:sz w:val="19"/>
+        </w:rPr>
+        <w:t>Renovación válida del 8 al 15 de octubre de 2026. El historial registra las tres fechas y queda con una entrada.</w:t>
+      </w:r>
+    </w:p>
+    <w:p>
+      <w:pPr>
+        <w:spacing w:after="60"/>
+        <w:jc w:val="center"/>
+      </w:pPr>
+      <w:r>
+        <w:drawing>
+          <wp:inline xmlns:a="http://schemas.openxmlformats.org/drawingml/2006/main" xmlns:pic="http://schemas.openxmlformats.org/drawingml/2006/picture">
+            <wp:extent cx="5166360" cy="3418260"/>
+            <wp:docPr id="6" name="Picture 6" descr="Intento con la misma fecha vigente. Se rechaza la renovación y se conserva la fecha del 15 de octubre y una sola entrada en el historial."/>
+            <wp:cNvGraphicFramePr>
+              <a:graphicFrameLocks noChangeAspect="1"/>
+            </wp:cNvGraphicFramePr>
+            <a:graphic>
+              <a:graphicData uri="http://schemas.openxmlformats.org/drawingml/2006/picture">
+                <pic:pic>
+                  <pic:nvPicPr>
+                    <pic:cNvPr id="0" name="interfaz_invalida.png"/>
+                    <pic:cNvPicPr/>
+                  </pic:nvPicPr>
+                  <pic:blipFill>
+                    <a:blip r:embed="rId17"/>
+                    <a:stretch>
+                      <a:fillRect/>
+                    </a:stretch>
+                  </pic:blipFill>
+                  <pic:spPr>
+                    <a:xfrm>
+                      <a:off x="0" y="0"/>
+                      <a:ext cx="5166360" cy="3418260"/>
+                    </a:xfrm>
+                    <a:prstGeom prst="rect"/>
+                  </pic:spPr>
+                </pic:pic>
+              </a:graphicData>
+            </a:graphic>
+          </wp:inline>
+        </w:drawing>
+      </w:r>
+    </w:p>
+    <w:p>
+      <w:pPr>
+        <w:spacing w:after="120"/>
+      </w:pPr>
+      <w:r>
+        <w:rPr>
+          <w:sz w:val="19"/>
+        </w:rPr>
+        <w:t>Intento con la misma fecha vigente. Se rechaza la renovación y se conserva la fecha del 15 de octubre y una sola entrada en el historial.</w:t>
+      </w:r>
+    </w:p>
+    <w:p>
+      <w:r>
+        <w:br w:type="page"/>
+      </w:r>
+    </w:p>
+    <w:p>
+      <w:pPr>
+        <w:pStyle w:val="Heading1"/>
+        <w:spacing w:after="80"/>
+      </w:pPr>
+      <w:r>
+        <w:t>8 Vista funcional mediante componentes UML</w:t>
+      </w:r>
+    </w:p>
+    <w:p>
+      <w:pPr>
+        <w:spacing w:after="80"/>
+        <w:jc w:val="center"/>
+      </w:pPr>
+      <w:r>
+        <w:drawing>
+          <wp:inline xmlns:a="http://schemas.openxmlformats.org/drawingml/2006/main" xmlns:pic="http://schemas.openxmlformats.org/drawingml/2006/picture">
+            <wp:extent cx="5166360" cy="3486598"/>
+            <wp:docPr id="4" name="Picture 4" descr="Diagrama de los cuatro componentes funcionales de SmartLibrary exportado desde Visual Paradigm Online"/>
+            <wp:cNvGraphicFramePr>
+              <a:graphicFrameLocks noChangeAspect="1"/>
+            </wp:cNvGraphicFramePr>
+            <a:graphic>
+              <a:graphicData uri="http://schemas.openxmlformats.org/drawingml/2006/picture">
+                <pic:pic>
+                  <pic:nvPicPr>
+                    <pic:cNvPr id="0" name="componentes_vp.png"/>
+                    <pic:cNvPicPr/>
+                  </pic:nvPicPr>
+                  <pic:blipFill>
+                    <a:blip r:embed="rId13"/>
+                    <a:stretch>
+                      <a:fillRect/>
+                    </a:stretch>
+                  </pic:blipFill>
+                  <pic:spPr>
+                    <a:xfrm>
+                      <a:off x="0" y="0"/>
+                      <a:ext cx="5166360" cy="3486598"/>
+                    </a:xfrm>
+                    <a:prstGeom prst="rect"/>
+                  </pic:spPr>
+                </pic:pic>
+              </a:graphicData>
+            </a:graphic>
+          </wp:inline>
+        </w:drawing>
+      </w:r>
+    </w:p>
+    <w:p>
+      <w:pPr>
+        <w:spacing w:after="80"/>
+      </w:pPr>
       <w:r>
         <w:t>Las flechas discontinuas apuntan al componente del que se necesita información. Los cuatro componentes agrupan funciones de SmartLibrary, de acuerdo con R14.</w:t>
       </w:r>
+    </w:p>
+    <w:p>
+      <w:pPr>
+        <w:spacing w:after="80"/>
+      </w:pPr>
+      <w:hyperlink r:id="rId15">
+        <w:r>
+          <w:rPr>
+            <w:color w:val="0563C1"/>
+          </w:rPr>
+          <w:t>Diagrama de componentes editable en Visual Paradigm Online</w:t>
+        </w:r>
+      </w:hyperlink>
     </w:p>
     <w:tbl>
       <w:tblPr>
@@ -2596,12 +2743,16 @@
     <w:p>
       <w:pPr>
         <w:pStyle w:val="Heading1"/>
+        <w:spacing w:after="80" w:before="200"/>
       </w:pPr>
       <w:r>
         <w:t>9 Conclusión</w:t>
       </w:r>
     </w:p>
     <w:p>
+      <w:pPr>
+        <w:spacing w:after="80"/>
+      </w:pPr>
       <w:r>
         <w:t>Al diseñar las relaciones, ya no basta con listar los datos de cada clase. Hay que decidir quién conoce a quién y qué objetos dependen del ciclo de vida de otros. En SmartLibrary, el estudiante y el ejemplar mantienen su identidad después de un préstamo, mientras que una renovación solo tiene sentido dentro de su historial. La herencia permite reconocer a estudiantes y bibliotecarios como usuarios, pero necesita una razón del dominio. Notificable añade una capacidad sin obligar a todos los usuarios a tenerla. Estas decisiones también afectan al código: renovar debe conservar las fechas anteriores y rechazar cambios inválidos. La vista de componentes ayuda a ubicar las funciones y sus colaboraciones. El resultado es un modelo que explica las reglas de la biblioteca y un fragmento de código que permite comprobarlas.</w:t>
       </w:r>

</xml_diff>